<commit_message>
docs(system-design): embed bespoke SentroniX diagrams and update Chapter 4 docx
</commit_message>
<xml_diff>
--- a/Chapter_4_System_Design.docx
+++ b/Chapter_4_System_Design.docx
@@ -43,7 +43,7 @@
           <w:color w:val="000000"/>
           <w:sz w:val="24"/>
         </w:rPr>
-        <w:t>The SentroniX Purple Team AI Platform is organised into a set of cooperating modules that together enable security operators to execute simulated adversary tradecraft, inspect raw HTTP packet stream telemetry in real time, configure dynamic Web Application Firewall (WAF) defense policies, and automatically synthesize generative AI code remediation diffs. Each module has a clearly bounded responsibility, communicates with the others through defined RESTful and WebSocket interfaces, and can be developed, tested, and maintained independently. The modules identified below correspond to the functional blocks realised in the React.js and Next.js frontend, the FastAPI asynchronous backend, the Celery distributed task worker, the PostgreSQL relational database, the Redis telemetry broker, and the Google Gemini 3.6 Flash generative AI engine, as reflected in the Entity-Relationship Diagram, the Use Case Diagram, the Adversary Strike Sequence Diagram, the User Registration and Login Sequence Diagram, and the Execution Activity Diagram.</w:t>
+        <w:t>The SentroniX Purple Team AI Platform is organised into a set of cooperating architectural modules that together enable security operators to execute simulated adversary tradecraft, inspect raw HTTP packet stream telemetry in real time, configure dynamic Web Application Firewall (WAF) defense policies, and automatically synthesize generative AI code remediation diffs. Each module has a clearly bounded responsibility, communicates with the others through defined RESTful and WebSocket interfaces, and can be developed, tested, and maintained independently. The modules identified below correspond to the functional blocks realised in the React.js and Next.js frontend, the FastAPI asynchronous backend, the Celery distributed task worker, the PostgreSQL relational database, the Redis telemetry broker, and the Google Gemini 3.6 Flash generative AI engine, as reflected in the Entity-Relationship Diagram, the Use Case Diagram, the Adversary Strike Simulation Sequence Diagram, the Autonomous AI Remediation Sequence Diagram, and the Execution Activity Diagram.</w:t>
       </w:r>
     </w:p>
     <w:p>
@@ -72,7 +72,7 @@
           <w:color w:val="000000"/>
           <w:sz w:val="24"/>
         </w:rPr>
-        <w:t>This module allows a new analyst to create an account and allows an existing analyst or administrator to log in. It accepts the user's name, email, password, and contact details, checks the PostgreSQL database to confirm that the supplied email does not already exist, stores the validated details in the User table, and issues a cryptographic password hash using Bcrypt with an adaptive work factor. During login, the module validates the submitted credentials against the stored record and, on success, requests a signed JSON Web Token (JWT) from the Auth Service so that subsequent requests from the React UI can be authenticated without re-entering credentials. Its output is either a registration confirmation, a login error, or an access token that is handed to the React UI and stored for use on protected operational routes.</w:t>
+        <w:t>This module allows a new analyst to create an account and allows an existing analyst or administrator to log in. It accepts the user's name, email, password, and contact details, checks the PostgreSQL database to confirm that the supplied email does not already exist, stores the validated details in the users table, and issues a cryptographic password hash using Argon2id / Bcrypt with an adaptive work factor. During login, the module validates the submitted credentials against the stored record and, on success, requests a signed JSON Web Token (JWT) from the Auth Service so that subsequent requests from the React UI can be authenticated without re-entering credentials. Its output is either a registration confirmation, a login error, or an access token that is handed to the React UI and stored for use on protected operational routes.</w:t>
       </w:r>
     </w:p>
     <w:p>
@@ -309,7 +309,7 @@
           <w:color w:val="000000"/>
           <w:sz w:val="24"/>
         </w:rPr>
-        <w:t>The data layer of SentroniX is implemented in PostgreSQL 15, supplemented by Redis 7 for real-time telemetry caching and Celery task brokering. The relational storage model is organized around core tables that coordinate user authentication, adversary strike records, centralized vulnerability findings, steganographic analysis dumps, dynamic WAF rule policies, and automated GitHub remediation pull requests. Data enters the system through the React frontend, is validated and normalized by the FastAPI gateway, and is written to or read from these tables as each operational flow requires.</w:t>
+        <w:t>The data layer of SentroniX is implemented in PostgreSQL 16.2 with AsyncPG high-throughput connection pooling, supplemented by Redis 7 for real-time telemetry caching and Celery task brokering. The relational storage model is organized around core tables that coordinate user authentication, adversary strike records, centralized vulnerability findings, steganographic analysis dumps, dynamic WAF rule policies, and automated GitHub remediation pull requests. Data enters the system through the React frontend, is validated and normalized by the FastAPI gateway, and is written to or read from these tables as each operational flow requires.</w:t>
       </w:r>
     </w:p>
     <w:p>
@@ -338,7 +338,7 @@
           <w:color w:val="000000"/>
           <w:sz w:val="24"/>
         </w:rPr>
-        <w:t>The schema below is derived directly from the Entity-Relationship Diagram of SentroniX. Each table is described individually, together with its attributes, primary key, and foreign keys where applicable. Figure 4.1 illustrates the structural entity-relationship model and cardinality associations connecting offensive strikes to defensive remediation lifecycles.</w:t>
+        <w:t>The schema below is derived directly from the Entity-Relationship Diagram of SentroniX shown in Figure 4.1. The schema implements a modern, highly normalized database architecture with explicit Primary Key (PK) and Foreign Key (FK) constraints, strict data types, non-nullable operational invariants, and Crow's Foot cardinality relationships. Figure 4.1 illustrates the structural entity-relationship model connecting offensive strikes to defensive remediation lifecycles.</w:t>
       </w:r>
     </w:p>
     <w:p>
@@ -349,7 +349,7 @@
       <w:r>
         <w:drawing>
           <wp:inline xmlns:a="http://schemas.openxmlformats.org/drawingml/2006/main" xmlns:pic="http://schemas.openxmlformats.org/drawingml/2006/picture">
-            <wp:extent cx="5852160" cy="4523852"/>
+            <wp:extent cx="5852160" cy="4378595"/>
             <wp:docPr id="1" name="Picture 1"/>
             <wp:cNvGraphicFramePr>
               <a:graphicFrameLocks noChangeAspect="1"/>
@@ -370,7 +370,7 @@
                   <pic:spPr>
                     <a:xfrm>
                       <a:off x="0" y="0"/>
-                      <a:ext cx="5852160" cy="4523852"/>
+                      <a:ext cx="5852160" cy="4378595"/>
                     </a:xfrm>
                     <a:prstGeom prst="rect"/>
                   </pic:spPr>
@@ -393,7 +393,7 @@
           <w:color w:val="374151"/>
           <w:sz w:val="20"/>
         </w:rPr>
-        <w:t>Figure 4.1: Entity-Relationship Diagram</w:t>
+        <w:t>Figure 4.1: SentroniX Relational Database Schema &amp; Entity Architecture (Crow's Foot / UML)</w:t>
       </w:r>
     </w:p>
     <w:p>
@@ -408,7 +408,7 @@
           <w:color w:val="1E3A8A"/>
           <w:sz w:val="24"/>
         </w:rPr>
-        <w:t>User Table</w:t>
+        <w:t>1. Users Entity (users)</w:t>
       </w:r>
     </w:p>
     <w:p>
@@ -422,7 +422,7 @@
           <w:color w:val="000000"/>
           <w:sz w:val="24"/>
         </w:rPr>
-        <w:t>The User table stores the account information of every registered security analyst and operator. Its primary key, user_id, is an INT that uniquely identifies each user. The name attribute is a VARCHAR(100) holding the user's full name, and email is a VARCHAR(100) constrained as UNIQUE so that no two accounts can share the same address. The password attribute is a VARCHAR(255), sized to accommodate a Bcrypt cryptographic hash digest rather than plain text, and phone is a VARCHAR(15). The role attribute is an ENUM restricted to the values 'user' and 'admin', which determines whether the account can access administrative WAF configuration switchboards, and created_at is a DATETIME recording when the account was opened.</w:t>
+        <w:t>The users table stores account authentication and identity attributes for all platform operators. Its primary key, id, is an immutable UUID [PK]. It enforces uniqueness on username VARCHAR(64) and email VARCHAR(120) to guarantee account isolation. The hashed_password column is sized as VARCHAR(255) to accommodate Argon2id / Bcrypt salted hash digests (RFC 9106), ensuring zero plain-text credential persistence. The role attribute is a VARCHAR(20) restricting authorization tiers (e.g. 'analyst', 'admin'), is_active is a BOOLEAN flag governing immediate access revocation, and created_at / last_login are TIMESTAMP fields establishing an immutable user audit baseline.</w:t>
       </w:r>
     </w:p>
     <w:p>
@@ -437,7 +437,7 @@
           <w:color w:val="1E3A8A"/>
           <w:sz w:val="24"/>
         </w:rPr>
-        <w:t>Admin Table</w:t>
+        <w:t>2. Red Team Strikes Entity (red_team_strikes)</w:t>
       </w:r>
     </w:p>
     <w:p>
@@ -451,7 +451,7 @@
           <w:color w:val="000000"/>
           <w:sz w:val="24"/>
         </w:rPr>
-        <w:t>The Admin table is kept separate from the User table and stores administrator accounts with admin_id as its primary key. It holds name as VARCHAR(100), email as a UNIQUE VARCHAR(100), password as VARCHAR(255), and created_at as DATETIME. Keeping Admin as a distinct table, rather than relying solely on the role attribute of User, allows administrative accounts, global WAF policy switchboards, and platform-wide API keys to be managed and audited independently of ordinary analyst accounts.</w:t>
+        <w:t>The red_team_strikes table acts as the offensive telemetry log, recording every adversary emulation probe dispatched across the network. The primary key, strike_id, is a VARCHAR(64) cryptographic UUID. It maintains a strict foreign key, user_id, referencing users(id) with an [initiates] 1-to-N relationship. Key attributes include scenario_name VARCHAR(100), attack_vector VARCHAR(50) (e.g. 'SQL_INJECTION', 'XSS', 'SSRF'), target_endpoint VARCHAR(255), and injected_payload TEXT storing the exact adversarial byte sequence. The defense_status attribute stores the terminal firewall verdict ('INTERCEPTED' vs 'BYPASSED'), status_code INTEGER captures the returned HTTP response code (403 vs 200), latency_ms FLOAT measures sub-millisecond execution duration, and created_at TIMESTAMP records execution time.</w:t>
       </w:r>
     </w:p>
     <w:p>
@@ -466,7 +466,7 @@
           <w:color w:val="1E3A8A"/>
           <w:sz w:val="24"/>
         </w:rPr>
-        <w:t>Strike_Telemetry Table</w:t>
+        <w:t>3. WAF Defense Telemetry Entity (waf_defense_telemetry)</w:t>
       </w:r>
     </w:p>
     <w:p>
@@ -480,7 +480,7 @@
           <w:color w:val="000000"/>
           <w:sz w:val="24"/>
         </w:rPr>
-        <w:t>The Strike_Telemetry table records every adversary strike and fuzzing probe executed through the purple team arena. Its primary key is strike_id, a VARCHAR(64) cryptographic UUID. It holds a foreign key, user_id, referencing the User table, implementing the Performs relationship in which one analyst may perform many strikes. The scenario_id attribute is a VARCHAR(64) identifying the Atomic Red Team or Caldera test vector. mitre_technique is a VARCHAR(64) recording the formal technique identifier (e.g. T1059.001), target_endpoint is a VARCHAR(255) holding the evaluated URI, and injected_payload is a TEXT field carrying the exact raw exploit payload dispatched over the network. defense_status is an ENUM of 'INTERCEPTED' and 'BYPASSED', status_code is an INT storing the HTTP response status (403 Forbidden vs 200 OK), latency_ms is a FLOAT storing the round-trip detection time in milliseconds, and executed_at is a DATETIME marking the execution event.</w:t>
+        <w:t>The waf_defense_telemetry table provides deep defensive inspection telemetry. Each record links directly to red_team_strikes via the foreign key strike_id with an [intercepted_by] 1-to-1/N cardinality. Its primary key is telemetry_id UUID. The rule_triggered VARCHAR(64) records the specific AST or regex signature triggered (e.g. 'AST-SQLI-01'), action_taken VARCHAR(20) logs the enforcement mechanism ('BLOCK_403', 'ALLOW_200', 'RATE_LIMIT'), inspection_latency_ms FLOAT records internal firewall evaluation speed (&lt;15ms), client_ip INET captures source network addressing, and timestamp TIMESTAMP logs the interception epoch.</w:t>
       </w:r>
     </w:p>
     <w:p>
@@ -495,7 +495,7 @@
           <w:color w:val="1E3A8A"/>
           <w:sz w:val="24"/>
         </w:rPr>
-        <w:t>Unified_Finding Table</w:t>
+        <w:t>4. Unified Findings Entity (unified_findings)</w:t>
       </w:r>
     </w:p>
     <w:p>
@@ -509,7 +509,7 @@
           <w:color w:val="000000"/>
           <w:sz w:val="24"/>
         </w:rPr>
-        <w:t>The Unified_Finding table represents the centralized vulnerability ledger across all offensive and defensive tools. Its primary key is finding_id, an auto-incrementing INT. It holds a foreign key, strike_id, referencing the Strike_Telemetry table, implementing the Produces relationship where an adversary strike may produce one or more actionable findings. pillar is a VARCHAR(64) categorizing the origin as RED_TEAM, SAST, DAST, SCA, or STEG. tool_used is a VARCHAR(64) identifying the detection engine (e.g. Atomic Red Team, Semgrep, StegSeek). vulnerability_title is a VARCHAR(255), severity is an ENUM of 'CRITICAL', 'HIGH', 'MEDIUM', and 'LOW', cwe_id is a VARCHAR(32) recording the Common Weakness Enumeration mapping (e.g. CWE-89), location is a VARCHAR(512) storing the file path or URI endpoint, and created_at is a DATETIME marking when the vulnerability was identified.</w:t>
+        <w:t>The unified_findings table serves as the central vulnerability ledger across all purple team operations. It connects to red_team_strikes via foreign key strike_id under a [yields] 1-to-N relationship, meaning an adversary strike can uncover multiple related weaknesses. Its primary key is finding_id UUID. Attributes include title VARCHAR(150), pillar VARCHAR(50) (e.g. 'RED_TEAM', 'SAST', 'DAST', 'STEGO'), cwe_id VARCHAR(32) recording Common Weakness Enumeration standards (e.g. 'CWE-89'), severity VARCHAR(20) ('CRITICAL', 'HIGH', 'MEDIUM', 'LOW'), source_file VARCHAR(255) and line_number INTEGER pinpointing the exact vulnerable code location, and discovered_at TIMESTAMP.</w:t>
       </w:r>
     </w:p>
     <w:p>
@@ -524,7 +524,7 @@
           <w:color w:val="1E3A8A"/>
           <w:sz w:val="24"/>
         </w:rPr>
-        <w:t>AI_Remediation_Patch Table</w:t>
+        <w:t>5. AI Remediation Patches Entity (ai_remediation_patches)</w:t>
       </w:r>
     </w:p>
     <w:p>
@@ -538,7 +538,7 @@
           <w:color w:val="000000"/>
           <w:sz w:val="24"/>
         </w:rPr>
-        <w:t>The AI_Remediation_Patch table stores the generative AI remediation synthesized for identified vulnerabilities. Its primary key is patch_id, an auto-incrementing INT, and it carries a foreign key, finding_id, referencing the Unified_Finding table. This relationship is defined in the diagram as one-to-one through the Generates relationship, meaning every eligible finding can produce an authoritative remediation patch. model_version is a VARCHAR(64) recording the LLM core utilized (e.g. Gemini 3.6 Flash), unified_diff is a TEXT field storing the standardized git diff patch (`--- a/`, `+++ b/`), explanation is a TEXT field carrying the architectural root-cause analysis, qa_checklist is a TEXT field detailing verification steps, and generated_at is a DATETIME recording when the patch was synthesized.</w:t>
+        <w:t>The ai_remediation_patches table stores generative AI code fixes synthesized by Google Gemini 3.6 Flash. It maintains a foreign key finding_id referencing unified_findings(finding_id) under a [generates] 1-to-1 relationship. Its primary key is patch_id UUID. It stores model_identifier VARCHAR(64) ('gemini-3.6-flash'), unified_diff TEXT containing the RFC-compliant git patch (`--- a/`, `+++ b/`, `@@`), ast_verified BOOLEAN certifying that the patch parsed cleanly via `ast.parse()` without syntax errors, remediation_rationale TEXT explaining root-cause mitigation, and created_at TIMESTAMP.</w:t>
       </w:r>
     </w:p>
     <w:p>
@@ -553,7 +553,7 @@
           <w:color w:val="1E3A8A"/>
           <w:sz w:val="24"/>
         </w:rPr>
-        <w:t>GitHub_PR_Record Table</w:t>
+        <w:t>6. GitHub PR Records Entity (github_pr_records)</w:t>
       </w:r>
     </w:p>
     <w:p>
@@ -567,7 +567,7 @@
           <w:color w:val="000000"/>
           <w:sz w:val="24"/>
         </w:rPr>
-        <w:t>The GitHub_PR_Record table stores the audit trail for automated pull requests opened directly in customer repositories. Its primary key is pr_number, an INT assigned by GitHub. It holds a foreign key, patch_id, referencing the AI_Remediation_Patch table, implementing the Dispatches relationship where an AI patch is dispatched to version control. repo_slug is a VARCHAR(128) recording the repository owner and name, branch_name is a VARCHAR(128) holding the dedicated remediation branch, pr_url is a VARCHAR(512) holding the live HTTPS GitHub link, status is an ENUM of 'OPEN', 'MERGED', and 'CLOSED', and created_at is a DATETIME recording when the PR was created.</w:t>
+        <w:t>The github_pr_records table maintains the audit trail of automated pull requests dispatched to customer code repositories. It connects to ai_remediation_patches via foreign key patch_id under a [dispatches] 1-to-1 relationship. Its primary key is pr_record_id UUID. Key columns include repository_slug VARCHAR(128) (e.g. 'org/repo'), branch_name VARCHAR(128) ('fix/cwe-89-sqli'), pr_number INTEGER assigned by GitHub, pr_url VARCHAR(255) containing the direct merge link, pr_status VARCHAR(20) ('OPEN', 'MERGED', 'CLOSED').</w:t>
       </w:r>
     </w:p>
     <w:p>
@@ -582,7 +582,7 @@
           <w:color w:val="1E3A8A"/>
           <w:sz w:val="24"/>
         </w:rPr>
-        <w:t>Steg_Analysis Table</w:t>
+        <w:t>7. Stego Inspections Entity (stego_inspections)</w:t>
       </w:r>
     </w:p>
     <w:p>
@@ -596,7 +596,36 @@
           <w:color w:val="000000"/>
           <w:sz w:val="24"/>
         </w:rPr>
-        <w:t>The Steg_Analysis table stores the forensic outcomes of uploaded carrier images and suspicious files. Its primary key is steg_id, and it carries a foreign key, user_id, referencing the User table, implementing the Submits relationship. filename is a VARCHAR(255) recording the uploaded carrier name, threat_detected is a BOOLEAN flag set to TRUE if embedded payloads or appended binary data are discovered, extracted_data is a TEXT field holding extracted strings or payload summaries, status is a VARCHAR(32), and created_at is a DATETIME marking the analysis completion.</w:t>
+        <w:t>The stego_inspections table stores deep forensic outcomes of carrier image uploads. It links to users via foreign key user_id under an [uploads] 1-to-N relationship. Its primary key is inspection_id UUID. Columns include carrier_filename VARCHAR(255), carrier_hash VARCHAR(64) (SHA-256 integrity hash), anomaly_detected BOOLEAN indicating presence of hidden archives or appended byte sequences, extracted_payload TEXT, and created_at TIMESTAMP.</w:t>
+      </w:r>
+    </w:p>
+    <w:p>
+      <w:pPr>
+        <w:keepNext/>
+        <w:spacing w:before="200" w:after="60" w:line="360" w:lineRule="auto"/>
+      </w:pPr>
+      <w:r>
+        <w:rPr>
+          <w:rFonts w:ascii="Times New Roman" w:hAnsi="Times New Roman"/>
+          <w:b/>
+          <w:color w:val="1E3A8A"/>
+          <w:sz w:val="24"/>
+        </w:rPr>
+        <w:t>8. WAF Rule Policies Entity (waf_rule_policies)</w:t>
+      </w:r>
+    </w:p>
+    <w:p>
+      <w:pPr>
+        <w:spacing w:line="360" w:lineRule="auto" w:after="120"/>
+        <w:jc w:val="both"/>
+      </w:pPr>
+      <w:r>
+        <w:rPr>
+          <w:rFonts w:ascii="Times New Roman" w:hAnsi="Times New Roman"/>
+          <w:color w:val="000000"/>
+          <w:sz w:val="24"/>
+        </w:rPr>
+        <w:t>The waf_rule_policies table stores dynamic firewall configuration rules governing real-time inspection. Its primary key is rule_id VARCHAR(64) (e.g. 'AST_SQLI_GUARD'). It stores rule_category VARCHAR(50), pattern_signature TEXT containing compiled AST rule criteria or regex signatures, is_enabled BOOLEAN reflecting the real-time switchboard toggle state, action_mode VARCHAR(20) ('BLOCK', 'LOG_ONLY'), and updated_at TIMESTAMP.</w:t>
       </w:r>
     </w:p>
     <w:p>
@@ -630,7 +659,7 @@
           <w:color w:val="000000"/>
           <w:sz w:val="24"/>
         </w:rPr>
-        <w:t>SentroniX applies a combination of primary key, foreign key, uniqueness, domain check, and application-level validation rules to keep the stored security telemetry, strike records, and remediation patches consistent and trustworthy across all operational states.</w:t>
+        <w:t>SentroniX applies a multi-tiered data integrity model spanning primary key constraints, foreign key referential cascades, cryptographic hashing standards, domain check invariants, and physical file isolation sandboxing.</w:t>
       </w:r>
     </w:p>
     <w:p>
@@ -642,10 +671,19 @@
       <w:r>
         <w:rPr>
           <w:rFonts w:ascii="Times New Roman" w:hAnsi="Times New Roman"/>
+          <w:b/>
           <w:color w:val="000000"/>
           <w:sz w:val="24"/>
         </w:rPr>
-        <w:t>Every table in the schema carries a single-column primary key (such as user_id, admin_id, finding_id, patch_id, pr_number, and steg_id), which PostgreSQL enforces as unique and non-null, guaranteeing that no two records of the same entity type can ever be confused with one another.</w:t>
+        <w:t xml:space="preserve">Primary Key Uniqueness: </w:t>
+      </w:r>
+      <w:r>
+        <w:rPr>
+          <w:rFonts w:ascii="Times New Roman" w:hAnsi="Times New Roman"/>
+          <w:color w:val="000000"/>
+          <w:sz w:val="24"/>
+        </w:rPr>
+        <w:t>Every entity in the schema utilizes an immutable UUID or structured unique string as its primary key (e.g. users.id, red_team_strikes.strike_id, unified_findings.finding_id), guaranteeing absolute entity identity and preventing sequence enumeration attacks.</w:t>
       </w:r>
     </w:p>
     <w:p>
@@ -657,10 +695,19 @@
       <w:r>
         <w:rPr>
           <w:rFonts w:ascii="Times New Roman" w:hAnsi="Times New Roman"/>
+          <w:b/>
           <w:color w:val="000000"/>
           <w:sz w:val="24"/>
         </w:rPr>
-        <w:t>Referential integrity is strictly maintained through foreign keys: Strike_Telemetry.user_id references User.user_id, Unified_Finding.strike_id references Strike_Telemetry.strike_id, AI_Remediation_Patch.finding_id references Unified_Finding.finding_id, GitHub_PR_Record.patch_id references AI_Remediation_Patch.patch_id, and Steg_Analysis.user_id references User.user_id. These constraints prevent an attack strike, vulnerability finding, AI patch, or pull request from being saved against a user, strike, or finding that does not exist. Furthermore, foreign keys enforce ON DELETE CASCADE to eliminate orphaned records upon data purge.</w:t>
+        <w:t xml:space="preserve">Referential Integrity Cascades: </w:t>
+      </w:r>
+      <w:r>
+        <w:rPr>
+          <w:rFonts w:ascii="Times New Roman" w:hAnsi="Times New Roman"/>
+          <w:color w:val="000000"/>
+          <w:sz w:val="24"/>
+        </w:rPr>
+        <w:t>Referential integrity is enforced at the database engine level via foreign keys with ON DELETE CASCADE and ON UPDATE RESTRICT behaviors. A strike telemetry record cannot exist without an authentic user; a unified finding cannot be created without a parent strike; and an AI remediation patch cannot exist without an authoritative finding.</w:t>
       </w:r>
     </w:p>
     <w:p>
@@ -672,10 +719,19 @@
       <w:r>
         <w:rPr>
           <w:rFonts w:ascii="Times New Roman" w:hAnsi="Times New Roman"/>
+          <w:b/>
           <w:color w:val="000000"/>
           <w:sz w:val="24"/>
         </w:rPr>
-        <w:t>The email column of both User and Admin is constrained as UNIQUE, which the User Registration and Authentication Module relies upon when it verifies whether an account already exists before permitting a new registration to proceed.</w:t>
+        <w:t xml:space="preserve">Cryptographic Credential Invariants: </w:t>
+      </w:r>
+      <w:r>
+        <w:rPr>
+          <w:rFonts w:ascii="Times New Roman" w:hAnsi="Times New Roman"/>
+          <w:color w:val="000000"/>
+          <w:sz w:val="24"/>
+        </w:rPr>
+        <w:t>Authentication credentials enforce strict uniqueness constraints on email and username attributes. Passwords are never persisted in plaintext; they are hashed using Argon2id with adaptive memory-cost and time-cost parameters (RFC 9106), accompanied by constant-time verification routines to neutralize side-channel timing attacks.</w:t>
       </w:r>
     </w:p>
     <w:p>
@@ -687,10 +743,19 @@
       <w:r>
         <w:rPr>
           <w:rFonts w:ascii="Times New Roman" w:hAnsi="Times New Roman"/>
+          <w:b/>
           <w:color w:val="000000"/>
           <w:sz w:val="24"/>
         </w:rPr>
-        <w:t>The role attribute of User is restricted through an ENUM definition to 'user' and 'admin', ensuring that administrative privileges can only be assigned through explicit administrative authorization.</w:t>
+        <w:t xml:space="preserve">Domain Check Constraints: </w:t>
+      </w:r>
+      <w:r>
+        <w:rPr>
+          <w:rFonts w:ascii="Times New Roman" w:hAnsi="Times New Roman"/>
+          <w:color w:val="000000"/>
+          <w:sz w:val="24"/>
+        </w:rPr>
+        <w:t>Enumerated domain types constrain critical operational attributes to deterministic sets: defense_status ('INTERCEPTED', 'BYPASSED'), severity ('CRITICAL', 'HIGH', 'MEDIUM', 'LOW'), and pr_status ('OPEN', 'MERGED', 'CLOSED'). This prevents malformed telemetry states from corrupting automated risk scoring.</w:t>
       </w:r>
     </w:p>
     <w:p>
@@ -702,10 +767,19 @@
       <w:r>
         <w:rPr>
           <w:rFonts w:ascii="Times New Roman" w:hAnsi="Times New Roman"/>
+          <w:b/>
           <w:color w:val="000000"/>
           <w:sz w:val="24"/>
         </w:rPr>
-        <w:t>The defense_status attribute of Strike_Telemetry is constrained to an ENUM of 'INTERCEPTED' and 'BYPASSED', guaranteeing that the scoring engine and resilience metrics can only compute success rates from deterministic, verified states.</w:t>
+        <w:t xml:space="preserve">Performance Indexing &amp; Non-Repudiation: </w:t>
+      </w:r>
+      <w:r>
+        <w:rPr>
+          <w:rFonts w:ascii="Times New Roman" w:hAnsi="Times New Roman"/>
+          <w:color w:val="000000"/>
+          <w:sz w:val="24"/>
+        </w:rPr>
+        <w:t>High-frequency queries are accelerated using dedicated B-Tree indexes on `red_team_strikes.created_at`, `unified_findings.cwe_id`, and `users.email`. Audit ledgers enforce append-only non-repudiation timestamps generated directly by database server clocks (`DEFAULT CURRENT_TIMESTAMP`).</w:t>
       </w:r>
     </w:p>
     <w:p>
@@ -717,70 +791,19 @@
       <w:r>
         <w:rPr>
           <w:rFonts w:ascii="Times New Roman" w:hAnsi="Times New Roman"/>
+          <w:b/>
           <w:color w:val="000000"/>
           <w:sz w:val="24"/>
         </w:rPr>
-        <w:t>The severity attribute of Unified_Finding is restricted to an ENUM of 'CRITICAL', 'HIGH', 'MEDIUM', and 'LOW', ensuring that the automated AI patch generation engine and CISO compliance reports interpret standardized risk ratings.</w:t>
+        <w:t xml:space="preserve">Physical File Design &amp; Execution Sandboxing: </w:t>
       </w:r>
-    </w:p>
-    <w:p>
-      <w:pPr>
-        <w:pStyle w:val="ListBullet"/>
-        <w:spacing w:line="360" w:lineRule="auto" w:after="80"/>
-        <w:jc w:val="both"/>
-      </w:pPr>
       <w:r>
         <w:rPr>
           <w:rFonts w:ascii="Times New Roman" w:hAnsi="Times New Roman"/>
           <w:color w:val="000000"/>
           <w:sz w:val="24"/>
         </w:rPr>
-        <w:t>The status attribute of GitHub_PR_Record is constrained to an ENUM of 'OPEN', 'MERGED', and 'CLOSED', mirroring native GitHub pull request lifecycles directly within the local telemetry ledger.</w:t>
-      </w:r>
-    </w:p>
-    <w:p>
-      <w:pPr>
-        <w:pStyle w:val="ListBullet"/>
-        <w:spacing w:line="360" w:lineRule="auto" w:after="80"/>
-        <w:jc w:val="both"/>
-      </w:pPr>
-      <w:r>
-        <w:rPr>
-          <w:rFonts w:ascii="Times New Roman" w:hAnsi="Times New Roman"/>
-          <w:color w:val="000000"/>
-          <w:sz w:val="24"/>
-        </w:rPr>
-        <w:t>Mandatory fields such as user_id, vulnerability_title, location, cwe_id, and target_endpoint are enforced as NOT NULL at the database level and are also validated on the React UI and FastAPI gateway before execution, reducing unnecessary network round trips.</w:t>
-      </w:r>
-    </w:p>
-    <w:p>
-      <w:pPr>
-        <w:pStyle w:val="ListBullet"/>
-        <w:spacing w:line="360" w:lineRule="auto" w:after="80"/>
-        <w:jc w:val="both"/>
-      </w:pPr>
-      <w:r>
-        <w:rPr>
-          <w:rFonts w:ascii="Times New Roman" w:hAnsi="Times New Roman"/>
-          <w:color w:val="000000"/>
-          <w:sz w:val="24"/>
-        </w:rPr>
-        <w:t>Authentication constraints require every protected API route to receive a valid cryptographic JWT token issued by the Auth Service; a request lacking a valid Bearer token is rejected at the gateway before it can reach any operational strike or finding endpoint.</w:t>
-      </w:r>
-    </w:p>
-    <w:p>
-      <w:pPr>
-        <w:pStyle w:val="ListBullet"/>
-        <w:spacing w:line="360" w:lineRule="auto" w:after="80"/>
-        <w:jc w:val="both"/>
-      </w:pPr>
-      <w:r>
-        <w:rPr>
-          <w:rFonts w:ascii="Times New Roman" w:hAnsi="Times New Roman"/>
-          <w:color w:val="000000"/>
-          <w:sz w:val="24"/>
-        </w:rPr>
-        <w:t>Physical file design enforces strict isolation for uploaded steganography and malware files. Uploaded binaries are hashed using SHA-256, stored in a sandboxed non-executable partition (`/app/uploads`), and automatically reclaimed after 60 minutes, preventing arbitrary file execution.</w:t>
+        <w:t>Uploaded binary files and forensic carrier images are subject to strict sandboxed file design. Uploaded files are immediately hashed (SHA-256), stored in an isolated `/app/uploads` volume mounted with the Linux `noexec` flag inside Docker, restricted to non-root execution permissions, and automatically purged after 60 minutes.</w:t>
       </w:r>
     </w:p>
     <w:p>
@@ -814,7 +837,7 @@
           <w:color w:val="000000"/>
           <w:sz w:val="24"/>
         </w:rPr>
-        <w:t>The procedural design of SentroniX describes how an operational security request moves from the moment an analyst interacts with the React UI to the moment an adversary strike is executed, telemetry is captured, and an automated code patch is deployed. The React UI is responsible for collecting operator inputs, managing responsive layout bounds, and rendering real-time telemetry; it never performs bypass validation or vulnerability classification itself. The FastAPI backend acts as the coordinating gateway: it validates every incoming request, dispatches attack payloads across internal sockets, evaluates WAF inspection rules, queries the Gemini AI core for code diff synthesis, and commits pull requests to GitHub. The Red Team Engine, WAF Interceptor, and Gemini AI Core are treated as specialized asynchronous services that the FastAPI gateway orchestrates before returning results to the user.</w:t>
+        <w:t>The procedural design of SentroniX describes how an operational security request moves from the moment an analyst interacts with the React UI to the moment an adversary strike is executed, telemetry is captured, and an automated code patch is deployed. The React UI is responsible for collecting operator inputs, managing responsive layout bounds, and rendering real-time telemetry; it never performs bypass validation or vulnerability classification itself. The FastAPI backend acts as the coordinating gateway: it validates every incoming request, dispatches attack payloads across internal sockets, evaluates WAF inspection rules, queries the Gemini AI core for code diff synthesis, and commits pull requests to GitHub.</w:t>
       </w:r>
     </w:p>
     <w:p>
@@ -843,7 +866,7 @@
           <w:color w:val="000000"/>
           <w:sz w:val="24"/>
         </w:rPr>
-        <w:t>The functional capabilities of SentroniX are formally specified through the Use Case Diagram in Figure 4.2. The diagram identifies two human actors, User (SecOps Analyst) and Admin, interacting with the SentroniX Purple Team AI Platform boundary.</w:t>
+        <w:t>The functional capabilities and role-based access boundaries of SentroniX are formally specified in the UML Use Case Diagram shown in Figure 4.2. The diagram establishes a clear system boundary containing core operational subsystems and models the interaction of two distinct human actors: the SecOps Analyst (Purple Team Operator) and the Security Admin (Platform Engineer).</w:t>
       </w:r>
     </w:p>
     <w:p>
@@ -854,7 +877,7 @@
       <w:r>
         <w:drawing>
           <wp:inline xmlns:a="http://schemas.openxmlformats.org/drawingml/2006/main" xmlns:pic="http://schemas.openxmlformats.org/drawingml/2006/picture">
-            <wp:extent cx="5852160" cy="4523852"/>
+            <wp:extent cx="5852160" cy="4378595"/>
             <wp:docPr id="2" name="Picture 2"/>
             <wp:cNvGraphicFramePr>
               <a:graphicFrameLocks noChangeAspect="1"/>
@@ -875,7 +898,7 @@
                   <pic:spPr>
                     <a:xfrm>
                       <a:off x="0" y="0"/>
-                      <a:ext cx="5852160" cy="4523852"/>
+                      <a:ext cx="5852160" cy="4378595"/>
                     </a:xfrm>
                     <a:prstGeom prst="rect"/>
                   </pic:spPr>
@@ -898,7 +921,7 @@
           <w:color w:val="374151"/>
           <w:sz w:val="20"/>
         </w:rPr>
-        <w:t>Figure 4.2: Use Case Diagram</w:t>
+        <w:t>Figure 4.2: SentroniX Unified Purple Team Platform Use Case Diagram</w:t>
       </w:r>
     </w:p>
     <w:p>
@@ -912,7 +935,7 @@
           <w:color w:val="000000"/>
           <w:sz w:val="24"/>
         </w:rPr>
-        <w:t>The Use Case Diagram identifies two primary actors, User and Admin, interacting with the SentroniX platform boundary. The User actor is associated with six independent use cases and one composite use case. View Dashboard gives the user a consolidated landing overview of recent security telemetry and risk posture. View Strike History lets the user browse past adversary simulations and detection verdicts. Download PDF Report lets the user retrieve compliance audit documentation for completed assessments. Inspect HTTP Stream opens the deep packet stream modal to review raw headers. Manage Profile lets the user update their personal account details. Upload Carrier Image (Steganography) allows the user to submit suspicious files for payload extraction. Register / Login is shared between the User and Admin actors, since both must authenticate before reaching any protected operational view.</w:t>
+        <w:t>The SecOps Analyst interacts with offensive simulation, defensive monitoring, and remediation features. The analyst can Authenticate via JWT Token, Select Strike Vector (Atomic / Caldera / Fuzzer), and Execute Adversary Strike. The execution flow incorporates two mandatory «include» relationships: Inspect Live HTTP Packet Stream and Correlate WAF Verdict (403 Block vs 200 Bypass), guaranteeing that every attack simulation is accompanied by real-time deep packet inspection and automated firewall correlation. The verdict feeds directly into Review Unified Finding (CWE, CVSS &amp; File Path), which connects to Synthesize AI Code Patch via an «extend» relationship, allowing the operator to initiate automated remediation upon discovering a confirmed penetration.</w:t>
       </w:r>
     </w:p>
     <w:p>
@@ -926,7 +949,7 @@
           <w:color w:val="000000"/>
           <w:sz w:val="24"/>
         </w:rPr>
-        <w:t>The composite use case, Submit Adversary Strike (Atomic / Caldera / Fuzzer), represents the primary point at which an offensive simulation is launched. This use case includes three further use cases through «include» relationships: Evaluate WAF Defense, View Telemetry Verdict, and Generate AI Code Patch. The «include» notation indicates that these three steps are not optional extensions but a mandatory sequence that always executes once an attack strike is submitted, reflecting that SentroniX never launches an adversary vector without also evaluating firewall interception, presenting the latency verdict, and preparing an AI remediation path. Generate AI Code Patch further connects to Dispatch GitHub PR through an «extend» relationship, allowing the analyst to optionally open an automated Pull Request in the target repository. The Admin actor is associated with three use cases: Register / Login, shared with the User actor as described above, Manage WAF Policies, which governs the live rule switchboard, and Manage Users &amp; API Keys, which controls platform access.</w:t>
+        <w:t>The Synthesize AI Code Patch use case enforces a mandatory «include» relationship with Verify AST Syntactic Diff (ast.parse), ensuring that generative code fixes are always syntactically certified before developer presentation. From this certified patch state, an optional «extend» relationship enables Dispatch GitHub Pull Request (Auto-Branch &amp; Commit) directly into the customer's remote repository. Additional analyst use cases include Analyze Stego Carrier Image (LSB &amp; Byte Entropy) and Export Purple Team PDF Report. The Security Admin actor governs administrative switchboards: Configure WAF Rule Switch (Toggle Inspection Engine) and Manage User Access &amp; Roles.</w:t>
       </w:r>
     </w:p>
     <w:p>
@@ -960,7 +983,7 @@
           <w:color w:val="000000"/>
           <w:sz w:val="24"/>
         </w:rPr>
-        <w:t>The end-to-end procedural execution flow of the platform is formally modeled in Figure 4.5 using a UML Activity Diagram with swimlanes. The diagram visualizes the parallel orchestration spanning the Security Operator, the FastAPI Gateway &amp; WAF, the Red Team Attack Engine, and the Gemini AI Core &amp; GitHub API.</w:t>
+        <w:t>The end-to-end procedural execution flow of the platform is formally modeled in Figure 4.5 using a UML Activity Diagram with swimlanes. The diagram organizes execution across four parallel responsibility lanes: Security Operator (UI), Red Team Runner (Attacker), WAF &amp; API Gateway (Defender), and AI Remediation (AI &amp; Git).</w:t>
       </w:r>
     </w:p>
     <w:p>
@@ -971,7 +994,7 @@
       <w:r>
         <w:drawing>
           <wp:inline xmlns:a="http://schemas.openxmlformats.org/drawingml/2006/main" xmlns:pic="http://schemas.openxmlformats.org/drawingml/2006/picture">
-            <wp:extent cx="5852160" cy="4523852"/>
+            <wp:extent cx="5852160" cy="4378595"/>
             <wp:docPr id="3" name="Picture 3"/>
             <wp:cNvGraphicFramePr>
               <a:graphicFrameLocks noChangeAspect="1"/>
@@ -992,7 +1015,7 @@
                   <pic:spPr>
                     <a:xfrm>
                       <a:off x="0" y="0"/>
-                      <a:ext cx="5852160" cy="4523852"/>
+                      <a:ext cx="5852160" cy="4378595"/>
                     </a:xfrm>
                     <a:prstGeom prst="rect"/>
                   </pic:spPr>
@@ -1015,7 +1038,7 @@
           <w:color w:val="374151"/>
           <w:sz w:val="20"/>
         </w:rPr>
-        <w:t>Figure 4.5: Adversary Execution &amp; Automated Remediation Activity Diagram</w:t>
+        <w:t>Figure 4.5: SentroniX Purple Team Continuous Emulation Activity Diagram</w:t>
       </w:r>
     </w:p>
     <w:p>
@@ -1029,7 +1052,21 @@
           <w:color w:val="000000"/>
           <w:sz w:val="24"/>
         </w:rPr>
-        <w:t>The activity flow begins in the Security Operator swimlane when an attack vector (e.g. Atomic Red Team, Caldera campaign, or Live Target Fuzzer) and endpoint are selected. Upon execution, control transitions to the Red Team Attack Engine, which synthesizes an HTTP socket request containing the raw exploit payload. The request enters the FastAPI Gateway &amp; WAF swimlane, where active AST rules and regex filters inspect the incoming headers. A decision node evaluates whether an active WAF rule intercepts the attack: if intercepted, an HTTP 403 Forbidden status is logged with sub-50ms latency; if bypassed, an HTTP 200 OK or 500 error triggers high-priority threat alerts. In parallel, the operator reviews the live telemetry console and initiates automated remediation. Control transitions to the Gemini AI &amp; GitHub API swimlane, where the LLM synthesizes a unified git diff patch. The GitHub API creates an isolated remediation branch, commits the diff, and opens a Pull Request, after which the analyst verifies neutralization and exports the audit PDF.</w:t>
+        <w:t>The activity begins in the Security Operator (UI) swimlane with Start -&gt; Configure Attack Vector &amp; Injected Payload. Control passes across the boundary to the Red Team Runner (Attacker), which executes Synthesize Exploit Socket &amp; Fire Inbound Request. The socket probe enters the WAF &amp; API Gateway (Defender) swimlane, where the middleware executes Intercept HTTP Packet &amp; Evaluate AST Rules. A decision diamond evaluates: Did WAF Rule Block Threat?</w:t>
+      </w:r>
+    </w:p>
+    <w:p>
+      <w:pPr>
+        <w:spacing w:line="360" w:lineRule="auto" w:after="120"/>
+        <w:jc w:val="both"/>
+      </w:pPr>
+      <w:r>
+        <w:rPr>
+          <w:rFonts w:ascii="Times New Roman" w:hAnsi="Times New Roman"/>
+          <w:color w:val="000000"/>
+          <w:sz w:val="24"/>
+        </w:rPr>
+        <w:t>If the rule blocked the threat [Yes: 403], execution transitions downward to Drop Connection (403) &amp; Log &lt;15ms Telemetry, and control routes directly back to the Security Operator swimlane to Display Neutralized Metric in Defense Dashboard. If the attack bypassed defenses [No: 200], control routes to Exploit Penetrated (200) &amp; Generate Unified Finding. This immediately triggers the AI Remediation (AI &amp; Git) swimlane: Synthesize Gemini Patch &amp; Verify AST Syntax, followed by Dispatch GitHub PR &amp; Commit Patch Branch. Finally, control returns to the operator to Review PR &amp; Export Unified Audit PDF, concluding at the terminal End state.</w:t>
       </w:r>
     </w:p>
     <w:p>
@@ -1063,7 +1100,7 @@
           <w:color w:val="000000"/>
           <w:sz w:val="24"/>
         </w:rPr>
-        <w:t>The chronological message exchanges governing system operations are detailed across two comprehensive sequence diagrams: Figure 4.3 illustrates the Adversary Strike and Telemetry Sequence Diagram, and Figure 4.4 illustrates the User Registration and Login Sequence Diagram.</w:t>
+        <w:t>The chronological message exchanges governing system operations are detailed across two comprehensive sequence diagrams: Figure 4.3 illustrates the Adversary Strike Simulation and WAF Interception Sequence Diagram, and Figure 4.4 illustrates the Autonomous Generative AI Code Patch and GitHub Pull Request Automation Sequence Diagram.</w:t>
       </w:r>
     </w:p>
     <w:p>
@@ -1074,7 +1111,7 @@
       <w:r>
         <w:drawing>
           <wp:inline xmlns:a="http://schemas.openxmlformats.org/drawingml/2006/main" xmlns:pic="http://schemas.openxmlformats.org/drawingml/2006/picture">
-            <wp:extent cx="5852160" cy="4523852"/>
+            <wp:extent cx="5852160" cy="4416725"/>
             <wp:docPr id="4" name="Picture 4"/>
             <wp:cNvGraphicFramePr>
               <a:graphicFrameLocks noChangeAspect="1"/>
@@ -1095,7 +1132,7 @@
                   <pic:spPr>
                     <a:xfrm>
                       <a:off x="0" y="0"/>
-                      <a:ext cx="5852160" cy="4523852"/>
+                      <a:ext cx="5852160" cy="4416725"/>
                     </a:xfrm>
                     <a:prstGeom prst="rect"/>
                   </pic:spPr>
@@ -1118,7 +1155,7 @@
           <w:color w:val="374151"/>
           <w:sz w:val="20"/>
         </w:rPr>
-        <w:t>Figure 4.3: Adversary Strike &amp; Telemetry Sequence Diagram</w:t>
+        <w:t>Figure 4.3: Adversary Strike Simulation &amp; WAF Interception Sequence Diagram</w:t>
       </w:r>
     </w:p>
     <w:p>
@@ -1132,7 +1169,7 @@
           <w:color w:val="000000"/>
           <w:sz w:val="24"/>
         </w:rPr>
-        <w:t>This sequence diagram traces a single adversary strike from initiation to AI patch generation across six lifelines: User, React UI, FastAPI Gateway, WAF Interceptor, Gemini AI Core, and PostgreSQL DB. The user first opens the purple team arena (step 1), selects a scenario (step 2), and configures the target endpoint and payload (step 3). When the user clicks Execute Atomic Strike, the React UI sends a strike request to the FastAPI Gateway (step 4). On receiving the request, the FastAPI Gateway validates the input internally (step 5), verifying that the target endpoint URI is well-formed before socket dispatch. The gateway invokes the WAF Interceptor to evaluate incoming headers against active AST inspection rules (step 6).</w:t>
+        <w:t>Figure 4.3 traces a single adversary strike from initiation to real-time telemetry capture across six lifelines: SecOps Analyst (Browser), React Frontend (Vite Client), FastAPI Gateway (API Router), WAF Interceptor (Middleware), Red Team Engine (Strike Dispatcher), and PostgreSQL DB (Telemetry Ledger). The analyst initiates the cycle by selecting a strike scenario (e.g. SQL Injection or Command Injection probe) and target endpoint from the React frontend (step 1). The React UI issues an asynchronous HTTP POST request to `/api/v1/red-team/strike` carrying the target URI and payload (step 2). The FastAPI gateway forwards the exploit probe to the internal Red Team Engine (step 3), which dispatches the raw socket request across the network to the evaluated endpoint (step 4), where it traverses the WAF Interceptor middleware.</w:t>
       </w:r>
     </w:p>
     <w:p>
@@ -1146,7 +1183,7 @@
           <w:color w:val="000000"/>
           <w:sz w:val="24"/>
         </w:rPr>
-        <w:t>The diagram shows an alt combined fragment with two mutually exclusive branches. In the first branch, taken when an AST rule triggers, the WAF Interceptor neutralizes the socket connection and returns an HTTP 403 Forbidden status in under 50 milliseconds (step 7a). In the second branch, taken when no active rule matches, the exploit bypasses inspection and returns an HTTP 200 OK unfiltered response (step 7b). Whichever branch is taken, the FastAPI Gateway saves the strike telemetry, status code, latency, and vulnerability findings to the PostgreSQL DB (step 8) and receives confirmation (step 9). The result is relayed back to the React UI (step 10) and displayed on the live scorecard and terminal console (step 11). At this point, the user may request automated remediation (step 12); the React UI calls the AI patch endpoint (step 13), the Gemini AI Core synthesizes a validated unified code diff (step 14), and the resulting diff is rendered in the AI Patch Modal ready for GitHub pull request creation (step 15).</w:t>
+        <w:t>The core defensive inspection is framed by an alt combined fragment with two deterministic branches. In the first branch, when incoming request headers or parameters trigger an active AST rule (e.g. `AST_SQLI_GUARD`), the WAF Interceptor immediately severs the socket connection and responds with an HTTP 403 Forbidden status within sub-15ms latency (step 5a), logging the neutralized strike telemetry into PostgreSQL (step 6a). In the alternative branch, if the attack vector bypasses defensive rules, the request traverses unhindered to the target application handler (HTTP 200 OK) (step 5b), whereupon the telemetry gateway inserts a High-Severity finding into the Unified Findings Ledger (step 6b). The gateway broadcasts the event over a real-time WebSocket connection to the frontend (step 7), dynamically updating the live scorecard and streaming terminal (step 8). The analyst can subsequently inspect the finding details and initiate generative AI remediation (steps 9–11).</w:t>
       </w:r>
     </w:p>
     <w:p>
@@ -1162,7 +1199,7 @@
       <w:r>
         <w:drawing>
           <wp:inline xmlns:a="http://schemas.openxmlformats.org/drawingml/2006/main" xmlns:pic="http://schemas.openxmlformats.org/drawingml/2006/picture">
-            <wp:extent cx="5852160" cy="4523852"/>
+            <wp:extent cx="5852160" cy="4474085"/>
             <wp:docPr id="5" name="Picture 5"/>
             <wp:cNvGraphicFramePr>
               <a:graphicFrameLocks noChangeAspect="1"/>
@@ -1171,7 +1208,7 @@
               <a:graphicData uri="http://schemas.openxmlformats.org/drawingml/2006/picture">
                 <pic:pic>
                   <pic:nvPicPr>
-                    <pic:cNvPr id="0" name="fig_4_4_sequence_auth.png"/>
+                    <pic:cNvPr id="0" name="fig_4_4_sequence_ai_patch.png"/>
                     <pic:cNvPicPr/>
                   </pic:nvPicPr>
                   <pic:blipFill>
@@ -1183,7 +1220,7 @@
                   <pic:spPr>
                     <a:xfrm>
                       <a:off x="0" y="0"/>
-                      <a:ext cx="5852160" cy="4523852"/>
+                      <a:ext cx="5852160" cy="4474085"/>
                     </a:xfrm>
                     <a:prstGeom prst="rect"/>
                   </pic:spPr>
@@ -1206,7 +1243,7 @@
           <w:color w:val="374151"/>
           <w:sz w:val="20"/>
         </w:rPr>
-        <w:t>Figure 4.4: User Registration &amp; Login Sequence Diagram</w:t>
+        <w:t>Figure 4.4: Autonomous AI Code Patch &amp; GitHub Pull Request Sequence Diagram</w:t>
       </w:r>
     </w:p>
     <w:p>
@@ -1220,7 +1257,7 @@
           <w:color w:val="000000"/>
           <w:sz w:val="24"/>
         </w:rPr>
-        <w:t>This diagram is divided into two independent flows, A and B, sharing the lifelines User, React UI, FastAPI Gateway, PostgreSQL DB, and Auth Service (JWT). In Flow A, the User Registration Flow, the user opens the registration page and submits account details (step 1). The React UI forwards the registration data to the FastAPI Gateway (step 2). The gateway's first action is not to write to the database, but to check whether the submitted email already exists in the PostgreSQL DB (step 3). An alt fragment governs two outcomes: if the email already exists, the gateway returns an HTTP 400 Bad Request error (step 4a) and takes no further action, protecting the UNIQUE constraint without relying on database exceptions; if the email is available, the gateway hashes the password using Bcrypt and inserts the new User record (step 4b), confirming successful registration to the user (step 5).</w:t>
+        <w:t>Figure 4.4 details the end-to-end procedural message sequence orchestrating automated code vulnerability remediation across six lifelines: SecOps Engineer (User), React Frontend (Findings Modal), FastAPI Gateway (Patch Service), Gemini 3.6 Flash (Generative Core), AST Validator (Python Engine), and GitHub API (Repo Remote). When an analyst clicks 'Generate AI Code Patch' on an identified vulnerability finding (step 1), the React frontend transmits a POST request to `/api/v1/ai/patch` containing the finding ID, vulnerable source file path, and CWE classification (step 2). The FastAPI gateway synthesizes a dynamically framed few-shot prompt with strict unified diff formatting guidelines (`--- a/`, `+++ b/`, `@@`) and OWASP ASVS rules, dispatching the request to the Google Gemini 3.6 Flash generative model (step 3). Operating at temperature T=0.2, the LLM returns a structured response containing the code diff hunk and architectural rationale (step 4).</w:t>
       </w:r>
     </w:p>
     <w:p>
@@ -1234,7 +1271,7 @@
           <w:color w:val="000000"/>
           <w:sz w:val="24"/>
         </w:rPr>
-        <w:t>In Flow B, the User Login Flow, the user submits their email and password (step 1). The React UI forwards the credentials to the FastAPI Gateway (step 2). The gateway queries the PostgreSQL DB by email and verifies the Bcrypt hash (step 3). The subsequent alt fragment governs two outcomes: on invalid credentials, an HTTP 401 Unauthorized error is returned immediately (step 4a) without contacting the Auth Service; on valid credentials, the gateway requests a signed JWT access token from the Auth Service (step 4b), receives the generated token (step 5), and returns it to the React UI, which stores the token and redirects the analyst to the Dashboard (step 6).</w:t>
+        <w:t>To guarantee zero hallucination and eliminate syntax regressions prior to developer exposure, the gateway transmits the synthesized diff to the AST Verification Sandbox (step 5). The validator executes `ast.parse()` on the candidate file tree (step 6), verifying syntactic correctness and certifying zero parse errors (step 7). The certified diff, remediation explanation, and QA verification checklist are returned to the React frontend (step 8) and rendered in a side-by-side diff viewer (step 9). Upon analyst approval (step 10), the frontend calls `/api/v1/ai/github-pr` (step 11). The FastAPI gateway authenticates via the GitHub REST API, creates an isolated remediation branch (e.g. `fix/cwe-89-sqli`), commits the patch hunk, and opens a formal Pull Request (step 12). The GitHub API returns the direct PR URL (step 13), which is broadcast to the operator interface alongside git checkout branch commands (step 14).</w:t>
       </w:r>
     </w:p>
     <w:p>
@@ -1278,7 +1315,7 @@
           <w:color w:val="000000"/>
           <w:sz w:val="24"/>
         </w:rPr>
-        <w:t>Registration &amp; Login Screens: Collects name, email, and password. Features real-time client-side format validation and returns error alerts without disclosing whether email or password caused authentication failure.</w:t>
+        <w:t>Registration &amp; Login Screens: Collects username, email, and password. Features real-time client-side format validation and returns error alerts without disclosing whether email or password caused authentication failure.</w:t>
       </w:r>
     </w:p>
     <w:p>
@@ -1413,7 +1450,7 @@
       <w:r>
         <w:drawing>
           <wp:inline xmlns:a="http://schemas.openxmlformats.org/drawingml/2006/main" xmlns:pic="http://schemas.openxmlformats.org/drawingml/2006/picture">
-            <wp:extent cx="5852160" cy="4681728"/>
+            <wp:extent cx="5852160" cy="4378595"/>
             <wp:docPr id="6" name="Picture 6"/>
             <wp:cNvGraphicFramePr>
               <a:graphicFrameLocks noChangeAspect="1"/>
@@ -1434,7 +1471,7 @@
                   <pic:spPr>
                     <a:xfrm>
                       <a:off x="0" y="0"/>
-                      <a:ext cx="5852160" cy="4681728"/>
+                      <a:ext cx="5852160" cy="4378595"/>
                     </a:xfrm>
                     <a:prstGeom prst="rect"/>
                   </pic:spPr>
@@ -1624,7 +1661,7 @@
           <w:color w:val="000000"/>
           <w:sz w:val="24"/>
         </w:rPr>
-        <w:t>Passwords are never stored in plain text. The password column of both User and Admin tables is sized as VARCHAR(255) specifically to hold a Bcrypt hash digest. The backend hashes passwords with an adaptive salt cost factor before insertion and verifies password equality using constant-time string comparison algorithms to prevent timing attacks.</w:t>
+        <w:t>Passwords are never stored in plain text. The password column of both users and admin tables is sized as VARCHAR(255) specifically to hold an Argon2id / Bcrypt hash digest. The backend hashes passwords with an adaptive salt cost factor before insertion and verifies password equality using constant-time string comparison algorithms to prevent timing attacks.</w:t>
       </w:r>
     </w:p>
     <w:p>

</xml_diff>